<commit_message>
Price permits by jurisdiction and travel by service zone
Answers the last three open items from 28 Sep 2026:

- Permit: each template has a Permit Fee parameter the estimator sets
  from DB's permit bills by jurisdiction (table on every workbook's Rates
  tab and in the proposal §9). Defaults stay at each type's old amount.
- Travel: a Service Zone parameter replaces typed-in travel hours. Travel
  is person-days x 0.5 h (Zone 2) or 1.25 h (Zone 3), from DB's own
  Service Call zone charges; Zone 1 adds none; Extended is quoted.
- Kitchen appliances are not supplied by default.

The intake sheets get a service-zone and permit row and still print on
two pages. Examples and calibration results are unchanged except the
Extended-zone bathroom (261280), which now gets 36 formula travel hours
against its estimated 30.

Co-Authored-By: Claude Opus 5.5 <noreply@anthropic.com>
Claude-Session: https://claude.ai/code/session_01Ch22kiCEY7KwpDM4Ye9Kr8
</commit_message>
<xml_diff>
--- a/docs/ballpark/addition-intake-sheet.docx
+++ b/docs/ballpark/addition-intake-sheet.docx
@@ -2342,7 +2342,7 @@
                 <w:sz w:val="17"/>
                 <w:szCs w:val="17"/>
               </w:rPr>
-              <w:t xml:space="preserve">Travel hours</w:t>
+              <w:t xml:space="preserve">Service zone</w:t>
             </w:r>
           </w:p>
         </w:tc>
@@ -2373,7 +2373,7 @@
                 <w:sz w:val="17"/>
                 <w:szCs w:val="17"/>
               </w:rPr>
-              <w:t xml:space="preserve">_______</w:t>
+              <w:t xml:space="preserve">☐ 1  ☐ 2  ☐ 3  ☐ Ext.</w:t>
             </w:r>
           </w:p>
         </w:tc>
@@ -2403,7 +2403,7 @@
                 <w:sz w:val="16"/>
                 <w:szCs w:val="16"/>
               </w:rPr>
-              <w:t xml:space="preserve">Only when the job is past the standard service zone. Ask the CGM for the number.</w:t>
+              <w:t xml:space="preserve">From the job's Service Zone in JobTread. Zone 1 adds no travel. Extended (over 50 mi): enter 4 and flag it.</w:t>
             </w:r>
           </w:p>
           <w:p>
@@ -2417,7 +2417,119 @@
                 <w:sz w:val="15"/>
                 <w:szCs w:val="15"/>
               </w:rPr>
-              <w:t xml:space="preserve">{Addition Travel Hours}</w:t>
+              <w:t xml:space="preserve">{Addition Service Zone}</w:t>
+            </w:r>
+          </w:p>
+        </w:tc>
+      </w:tr>
+      <w:tr>
+        <w:trPr>
+          <w:cantSplit/>
+        </w:trPr>
+        <w:tc>
+          <w:tcPr>
+            <w:tcW w:type="dxa" w:w="2700"/>
+            <w:tcBorders>
+              <w:top w:val="single" w:color="A6A6A6" w:sz="4"/>
+              <w:left w:val="single" w:color="A6A6A6" w:sz="4"/>
+              <w:bottom w:val="single" w:color="A6A6A6" w:sz="4"/>
+              <w:right w:val="single" w:color="A6A6A6" w:sz="4"/>
+            </w:tcBorders>
+            <w:tcMar>
+              <w:top w:type="dxa" w:w="35"/>
+              <w:left w:type="dxa" w:w="90"/>
+              <w:bottom w:type="dxa" w:w="35"/>
+              <w:right w:type="dxa" w:w="90"/>
+            </w:tcMar>
+          </w:tcPr>
+          <w:p>
+            <w:pPr>
+              <w:spacing w:after="40" w:before="0"/>
+            </w:pPr>
+            <w:r>
+              <w:rPr>
+                <w:rFonts w:ascii="Arial" w:cs="Arial" w:eastAsia="Arial" w:hAnsi="Arial"/>
+                <w:b/>
+                <w:bCs/>
+                <w:sz w:val="17"/>
+                <w:szCs w:val="17"/>
+              </w:rPr>
+              <w:t xml:space="preserve">Permit jurisdiction</w:t>
+            </w:r>
+          </w:p>
+        </w:tc>
+        <w:tc>
+          <w:tcPr>
+            <w:tcW w:type="dxa" w:w="2700"/>
+            <w:tcBorders>
+              <w:top w:val="single" w:color="A6A6A6" w:sz="4"/>
+              <w:left w:val="single" w:color="A6A6A6" w:sz="4"/>
+              <w:bottom w:val="single" w:color="A6A6A6" w:sz="4"/>
+              <w:right w:val="single" w:color="A6A6A6" w:sz="4"/>
+            </w:tcBorders>
+            <w:tcMar>
+              <w:top w:type="dxa" w:w="35"/>
+              <w:left w:type="dxa" w:w="90"/>
+              <w:bottom w:type="dxa" w:w="35"/>
+              <w:right w:type="dxa" w:w="90"/>
+            </w:tcMar>
+          </w:tcPr>
+          <w:p>
+            <w:pPr>
+              <w:spacing w:after="40" w:before="0"/>
+            </w:pPr>
+            <w:r>
+              <w:rPr>
+                <w:rFonts w:ascii="Arial" w:cs="Arial" w:eastAsia="Arial" w:hAnsi="Arial"/>
+                <w:color w:val="404040"/>
+                <w:sz w:val="17"/>
+                <w:szCs w:val="17"/>
+              </w:rPr>
+              <w:t xml:space="preserve">City / township: __________</w:t>
+            </w:r>
+          </w:p>
+        </w:tc>
+        <w:tc>
+          <w:tcPr>
+            <w:tcW w:type="dxa" w:w="6120"/>
+            <w:tcBorders>
+              <w:top w:val="single" w:color="A6A6A6" w:sz="4"/>
+              <w:left w:val="single" w:color="A6A6A6" w:sz="4"/>
+              <w:bottom w:val="single" w:color="A6A6A6" w:sz="4"/>
+              <w:right w:val="single" w:color="A6A6A6" w:sz="4"/>
+            </w:tcBorders>
+            <w:tcMar>
+              <w:top w:type="dxa" w:w="35"/>
+              <w:left w:type="dxa" w:w="90"/>
+              <w:bottom w:type="dxa" w:w="35"/>
+              <w:right w:type="dxa" w:w="90"/>
+            </w:tcMar>
+          </w:tcPr>
+          <w:p>
+            <w:pPr>
+              <w:spacing w:after="40" w:before="0"/>
+            </w:pPr>
+            <w:r>
+              <w:rPr>
+                <w:rFonts w:ascii="Arial" w:cs="Arial" w:eastAsia="Arial" w:hAnsi="Arial"/>
+                <w:sz w:val="16"/>
+                <w:szCs w:val="16"/>
+              </w:rPr>
+              <w:t xml:space="preserve">Where the permit is pulled. The estimator enters the fee.</w:t>
+            </w:r>
+          </w:p>
+          <w:p>
+            <w:pPr>
+              <w:spacing w:after="0" w:before="0"/>
+            </w:pPr>
+            <w:r>
+              <w:rPr>
+                <w:rFonts w:ascii="Courier New" w:cs="Courier New" w:eastAsia="Courier New" w:hAnsi="Courier New"/>
+                <w:color w:val="666666"/>
+                <w:sz w:val="15"/>
+                <w:szCs w:val="15"/>
+              </w:rPr>
+              <w:t xml:space="preserve">{Addition Permit Fee}</w:t>
             </w:r>
           </w:p>
         </w:tc>

</xml_diff>